<commit_message>
Actualizacion de la problematica
</commit_message>
<xml_diff>
--- a/DocumentosAsociados/ProblematicaTpMetodologia.docx
+++ b/DocumentosAsociados/ProblematicaTpMetodologia.docx
@@ -6,258 +6,644 @@
       <w:pPr>
         <w:pStyle w:val="Ttulo1"/>
         <w:rPr>
-          <w:rFonts w:ascii="Arial" w:hAnsi="Arial" w:cs="Arial"/>
+          <w:sz w:val="36"/>
+          <w:szCs w:val="36"/>
+          <w:lang w:val="es-AR"/>
+        </w:rPr>
+      </w:pPr>
+      <w:r>
+        <w:rPr>
+          <w:sz w:val="36"/>
+          <w:szCs w:val="36"/>
+          <w:lang w:val="es-AR"/>
+        </w:rPr>
+        <w:t>Propuesta de proyecto</w:t>
+      </w:r>
+    </w:p>
+    <w:p>
+      <w:pPr>
+        <w:rPr>
+          <w:sz w:val="22"/>
+          <w:szCs w:val="22"/>
+          <w:lang w:val="es-AR"/>
+        </w:rPr>
+      </w:pPr>
+      <w:r>
+        <w:rPr>
           <w:b/>
           <w:bCs/>
           <w:sz w:val="22"/>
           <w:szCs w:val="22"/>
           <w:lang w:val="es-AR"/>
         </w:rPr>
-      </w:pPr>
-      <w:r>
-        <w:rPr>
-          <w:rFonts w:ascii="Arial" w:hAnsi="Arial" w:cs="Arial"/>
+        <w:t>Grupo:</w:t>
+      </w:r>
+      <w:r>
+        <w:rPr>
+          <w:sz w:val="22"/>
+          <w:szCs w:val="22"/>
+          <w:lang w:val="es-AR"/>
+        </w:rPr>
+        <w:t xml:space="preserve"> 12</w:t>
+      </w:r>
+    </w:p>
+    <w:p>
+      <w:pPr>
+        <w:rPr>
+          <w:sz w:val="22"/>
+          <w:szCs w:val="22"/>
+          <w:lang w:val="es-AR"/>
+        </w:rPr>
+      </w:pPr>
+      <w:r>
+        <w:rPr>
           <w:b/>
           <w:bCs/>
           <w:sz w:val="22"/>
           <w:szCs w:val="22"/>
           <w:lang w:val="es-AR"/>
         </w:rPr>
-        <w:t>Metodología de trabajo</w:t>
-      </w:r>
-    </w:p>
-    <w:p>
-      <w:pPr>
-        <w:ind w:firstLine="720"/>
-        <w:rPr>
-          <w:rFonts w:ascii="Arial" w:hAnsi="Arial" w:cs="Arial"/>
-          <w:sz w:val="22"/>
-          <w:szCs w:val="22"/>
-          <w:lang w:val="es-AR"/>
-        </w:rPr>
-      </w:pPr>
-      <w:r>
-        <w:rPr>
-          <w:rFonts w:ascii="Arial" w:hAnsi="Arial" w:cs="Arial"/>
-          <w:sz w:val="22"/>
-          <w:szCs w:val="22"/>
-          <w:lang w:val="es-AR"/>
-        </w:rPr>
-        <w:t xml:space="preserve">Para el desarrollo del proyecto se utilizará la metodología </w:t>
-      </w:r>
-      <w:r>
-        <w:rPr>
-          <w:rFonts w:ascii="Arial" w:hAnsi="Arial" w:cs="Arial"/>
+        <w:t>Nombre del proyecto:</w:t>
+      </w:r>
+      <w:r>
+        <w:rPr>
+          <w:sz w:val="22"/>
+          <w:szCs w:val="22"/>
+          <w:lang w:val="es-AR"/>
+        </w:rPr>
+        <w:t xml:space="preserve"> Sistema de gestión y organización de inscripciones escolares</w:t>
+      </w:r>
+    </w:p>
+    <w:p>
+      <w:pPr>
+        <w:pStyle w:val="Ttulo2"/>
+        <w:rPr>
+          <w:sz w:val="28"/>
+          <w:szCs w:val="28"/>
+          <w:lang w:val="es-AR"/>
+        </w:rPr>
+      </w:pPr>
+      <w:r>
+        <w:rPr>
+          <w:sz w:val="28"/>
+          <w:szCs w:val="28"/>
+          <w:lang w:val="es-AR"/>
+        </w:rPr>
+        <w:t>Qué problema resuelve y quién lo usaría</w:t>
+      </w:r>
+    </w:p>
+    <w:p>
+      <w:pPr>
+        <w:rPr>
+          <w:sz w:val="22"/>
+          <w:szCs w:val="22"/>
+          <w:lang w:val="es-AR"/>
+        </w:rPr>
+      </w:pPr>
+      <w:r>
+        <w:rPr>
+          <w:sz w:val="22"/>
+          <w:szCs w:val="22"/>
+          <w:lang w:val="es-AR"/>
+        </w:rPr>
+        <w:t xml:space="preserve">Durante el proceso de inscripción en instituciones educativas públicas de la provincia de Buenos Aires, el personal administrativo debe organizar manualmente la información de los alumnos y aplicar los criterios establecidos para la asignación de vacantes. Estos criterios se encuentran definidos por el </w:t>
+      </w:r>
+      <w:r>
+        <w:rPr>
           <w:b/>
           <w:bCs/>
           <w:sz w:val="22"/>
           <w:szCs w:val="22"/>
           <w:lang w:val="es-AR"/>
         </w:rPr>
-        <w:t>Scrum</w:t>
-      </w:r>
-      <w:r>
-        <w:rPr>
-          <w:rFonts w:ascii="Arial" w:hAnsi="Arial" w:cs="Arial"/>
-          <w:sz w:val="22"/>
-          <w:szCs w:val="22"/>
-          <w:lang w:val="es-AR"/>
-        </w:rPr>
-        <w:t>, permitiendo organizar el trabajo de manera iterativa e incremental, mediante la planificación y seguimiento de las distintas tareas que conforman el proyecto.</w:t>
-      </w:r>
-    </w:p>
-    <w:p>
-      <w:pPr>
-        <w:pStyle w:val="Ttulo1"/>
-        <w:rPr>
-          <w:rFonts w:ascii="Arial" w:hAnsi="Arial" w:cs="Arial"/>
-          <w:sz w:val="22"/>
-          <w:szCs w:val="22"/>
-          <w:lang w:val="es-AR"/>
-        </w:rPr>
-      </w:pPr>
-      <w:r>
-        <w:rPr>
-          <w:rFonts w:ascii="Arial" w:hAnsi="Arial" w:cs="Arial"/>
-          <w:sz w:val="22"/>
-          <w:szCs w:val="22"/>
-          <w:lang w:val="es-AR"/>
-        </w:rPr>
-        <w:t>Problemática</w:t>
-      </w:r>
-    </w:p>
-    <w:p>
-      <w:pPr>
-        <w:pStyle w:val="Prrafodelista"/>
-        <w:ind w:firstLine="720"/>
-        <w:rPr>
-          <w:rFonts w:ascii="Arial" w:hAnsi="Arial" w:cs="Arial"/>
-          <w:sz w:val="22"/>
-          <w:szCs w:val="22"/>
-          <w:lang w:val="es-AR"/>
-        </w:rPr>
-      </w:pPr>
-      <w:r>
-        <w:rPr>
-          <w:rFonts w:ascii="Arial" w:hAnsi="Arial" w:cs="Arial"/>
-          <w:sz w:val="22"/>
-          <w:szCs w:val="22"/>
-          <w:lang w:val="es-AR"/>
-        </w:rPr>
-        <w:t xml:space="preserve">En las instituciones educativas públicas de la provincia de Buenos Aires, el proceso de inscripción y conformación de los listados de alumnos para el </w:t>
-      </w:r>
-      <w:r>
-        <w:rPr>
-          <w:rFonts w:ascii="Arial" w:hAnsi="Arial" w:cs="Arial"/>
+        <w:t>Decreto 2299/11, artículos 130° y 131° del Reglamento General de las Instituciones Educativas</w:t>
+      </w:r>
+      <w:r>
+        <w:rPr>
+          <w:sz w:val="22"/>
+          <w:szCs w:val="22"/>
+          <w:lang w:val="es-AR"/>
+        </w:rPr>
+        <w:t xml:space="preserve">. A su vez, la conformación de las secciones o salas se encuentra regulada por la </w:t>
+      </w:r>
+      <w:r>
+        <w:rPr>
           <w:b/>
           <w:bCs/>
           <w:sz w:val="22"/>
           <w:szCs w:val="22"/>
           <w:lang w:val="es-AR"/>
         </w:rPr>
-        <w:t>ciclo inicial</w:t>
-      </w:r>
-      <w:r>
-        <w:rPr>
-          <w:rFonts w:ascii="Arial" w:hAnsi="Arial" w:cs="Arial"/>
-          <w:sz w:val="22"/>
-          <w:szCs w:val="22"/>
-          <w:lang w:val="es-AR"/>
-        </w:rPr>
-        <w:t xml:space="preserve"> requiere una importante intervención manual por parte del personal administrativo de la institución. La asignación de vacantes debe realizarse teniendo en cuenta los criterios de prioridad establecidos por el </w:t>
-      </w:r>
-      <w:r>
-        <w:rPr>
-          <w:rFonts w:ascii="Arial" w:hAnsi="Arial" w:cs="Arial"/>
+        <w:t>Resolución 3367/05, Anexo 4</w:t>
+      </w:r>
+      <w:r>
+        <w:rPr>
+          <w:sz w:val="22"/>
+          <w:szCs w:val="22"/>
+          <w:lang w:val="es-AR"/>
+        </w:rPr>
+        <w:t>, que establece, entre otros aspectos, la cantidad de alumnos que puede integrar cada sección.</w:t>
+      </w:r>
+    </w:p>
+    <w:p>
+      <w:pPr>
+        <w:rPr>
+          <w:sz w:val="22"/>
+          <w:szCs w:val="22"/>
+          <w:lang w:val="es-AR"/>
+        </w:rPr>
+      </w:pPr>
+      <w:r>
+        <w:rPr>
+          <w:sz w:val="22"/>
+          <w:szCs w:val="22"/>
+          <w:lang w:val="es-AR"/>
+        </w:rPr>
+        <w:t>Para realizar esta tarea se deben considerar diferentes datos de los alumnos, como el domicilio, la distancia respecto del establecimiento, el turno preferido y la información de sus responsables. La organización manual de estos datos y la aplicación de los criterios correspondientes puede demandar una cantidad considerable de tiempo y aumentar la posibilidad de errores.</w:t>
+      </w:r>
+    </w:p>
+    <w:p>
+      <w:pPr>
+        <w:rPr>
+          <w:sz w:val="22"/>
+          <w:szCs w:val="22"/>
+          <w:lang w:val="es-AR"/>
+        </w:rPr>
+      </w:pPr>
+      <w:r>
+        <w:rPr>
+          <w:sz w:val="22"/>
+          <w:szCs w:val="22"/>
+          <w:lang w:val="es-AR"/>
+        </w:rPr>
+        <w:t xml:space="preserve">El sistema será utilizado principalmente por el </w:t>
+      </w:r>
+      <w:r>
+        <w:rPr>
           <w:b/>
           <w:bCs/>
           <w:sz w:val="22"/>
           <w:szCs w:val="22"/>
           <w:lang w:val="es-AR"/>
         </w:rPr>
-        <w:t>Decreto 2299/11,</w:t>
-      </w:r>
-      <w:r>
-        <w:rPr>
-          <w:rFonts w:ascii="Arial" w:hAnsi="Arial" w:cs="Arial"/>
+        <w:t>secretario o personal administrativo de la institución</w:t>
+      </w:r>
+      <w:r>
+        <w:rPr>
+          <w:sz w:val="22"/>
+          <w:szCs w:val="22"/>
+          <w:lang w:val="es-AR"/>
+        </w:rPr>
+        <w:t>, como herramienta de asistencia para la organización y conformación de los listados de inscripción.</w:t>
+      </w:r>
+    </w:p>
+    <w:p>
+      <w:pPr>
+        <w:pStyle w:val="Ttulo2"/>
+        <w:rPr>
+          <w:sz w:val="28"/>
+          <w:szCs w:val="28"/>
+          <w:lang w:val="es-AR"/>
+        </w:rPr>
+      </w:pPr>
+      <w:r>
+        <w:rPr>
+          <w:sz w:val="28"/>
+          <w:szCs w:val="28"/>
+          <w:lang w:val="es-AR"/>
+        </w:rPr>
+        <w:t>Qué hace</w:t>
+      </w:r>
+    </w:p>
+    <w:p>
+      <w:pPr>
+        <w:rPr>
+          <w:sz w:val="22"/>
+          <w:szCs w:val="22"/>
+          <w:lang w:val="es-AR"/>
+        </w:rPr>
+      </w:pPr>
+      <w:r>
+        <w:rPr>
+          <w:sz w:val="22"/>
+          <w:szCs w:val="22"/>
+          <w:lang w:val="es-AR"/>
+        </w:rPr>
+        <w:t xml:space="preserve">El sistema permitirá registrar y organizar la información de los alumnos inscriptos, calcular la distancia entre el domicilio del alumno y el establecimiento y organizar las solicitudes teniendo en cuenta los </w:t>
+      </w:r>
+      <w:r>
+        <w:rPr>
           <w:b/>
           <w:bCs/>
           <w:sz w:val="22"/>
           <w:szCs w:val="22"/>
           <w:lang w:val="es-AR"/>
         </w:rPr>
-        <w:t xml:space="preserve"> Artículos 130° y 131° del</w:t>
-      </w:r>
-      <w:r>
-        <w:rPr>
-          <w:rFonts w:ascii="Arial" w:hAnsi="Arial" w:cs="Arial"/>
+        <w:t>criterios de prioridad establecidos por el Decreto 2299/11</w:t>
+      </w:r>
+      <w:r>
+        <w:rPr>
+          <w:sz w:val="22"/>
+          <w:szCs w:val="22"/>
+          <w:lang w:val="es-AR"/>
+        </w:rPr>
+        <w:t>.</w:t>
+      </w:r>
+    </w:p>
+    <w:p>
+      <w:pPr>
+        <w:rPr>
+          <w:sz w:val="22"/>
+          <w:szCs w:val="22"/>
+          <w:lang w:val="es-AR"/>
+        </w:rPr>
+      </w:pPr>
+      <w:r>
+        <w:rPr>
+          <w:sz w:val="22"/>
+          <w:szCs w:val="22"/>
+          <w:lang w:val="es-AR"/>
+        </w:rPr>
+        <w:t xml:space="preserve">También permitirá considerar el </w:t>
+      </w:r>
+      <w:r>
+        <w:rPr>
           <w:b/>
           <w:bCs/>
           <w:sz w:val="22"/>
           <w:szCs w:val="22"/>
           <w:lang w:val="es-AR"/>
         </w:rPr>
-        <w:t xml:space="preserve"> Reglamento General de las Instituciones Educativas</w:t>
-      </w:r>
-      <w:r>
-        <w:rPr>
-          <w:rFonts w:ascii="Arial" w:hAnsi="Arial" w:cs="Arial"/>
-          <w:sz w:val="22"/>
-          <w:szCs w:val="22"/>
-          <w:lang w:val="es-AR"/>
-        </w:rPr>
-        <w:t xml:space="preserve">, mientras que la conformación de las secciones o salas se encuentra regulada por la </w:t>
-      </w:r>
-      <w:r>
-        <w:rPr>
-          <w:rFonts w:ascii="Arial" w:hAnsi="Arial" w:cs="Arial"/>
+        <w:t>turno preferido</w:t>
+      </w:r>
+      <w:r>
+        <w:rPr>
+          <w:sz w:val="22"/>
+          <w:szCs w:val="22"/>
+          <w:lang w:val="es-AR"/>
+        </w:rPr>
+        <w:t xml:space="preserve"> y organizar la conformación de las secciones de acuerdo con la </w:t>
+      </w:r>
+      <w:r>
+        <w:rPr>
           <w:b/>
           <w:bCs/>
           <w:sz w:val="22"/>
           <w:szCs w:val="22"/>
           <w:lang w:val="es-AR"/>
         </w:rPr>
-        <w:t>Resolución 3367/05, Anexo 4</w:t>
-      </w:r>
-      <w:r>
-        <w:rPr>
-          <w:rFonts w:ascii="Arial" w:hAnsi="Arial" w:cs="Arial"/>
-          <w:sz w:val="22"/>
-          <w:szCs w:val="22"/>
-          <w:lang w:val="es-AR"/>
-        </w:rPr>
-        <w:t>, que establece, entre otros aspectos, un límite de alumnos por sección.</w:t>
-      </w:r>
-    </w:p>
-    <w:p>
-      <w:pPr>
-        <w:pStyle w:val="Prrafodelista"/>
-        <w:ind w:firstLine="720"/>
-        <w:rPr>
-          <w:rFonts w:ascii="Arial" w:hAnsi="Arial" w:cs="Arial"/>
-          <w:sz w:val="22"/>
-          <w:szCs w:val="22"/>
-          <w:lang w:val="es-AR"/>
-        </w:rPr>
-      </w:pPr>
-      <w:r>
-        <w:rPr>
-          <w:rFonts w:ascii="Arial" w:hAnsi="Arial" w:cs="Arial"/>
-          <w:sz w:val="22"/>
-          <w:szCs w:val="22"/>
-          <w:lang w:val="es-AR"/>
-        </w:rPr>
-        <w:t>Actualmente, una vez finalizado el período de inscripción, el personal debe organizar manualmente la información de los alumnos y aplicar los distintos criterios establecidos para determinar el listado final. Entre los datos considerados se encuentran el domicilio del alumno, la distancia respecto del establecimiento, el turno preferido y la información de contacto de sus responsables. Esta tarea puede demandar una cantidad considerable de tiempo y, particularmente en aquellos casos en los que se presentan situaciones contempladas por los criterios de prioridad, requiere una intervención adicional por parte de la institución.</w:t>
-      </w:r>
-    </w:p>
-    <w:p>
-      <w:pPr>
-        <w:pStyle w:val="Prrafodelista"/>
-        <w:ind w:firstLine="720"/>
-        <w:rPr>
-          <w:rFonts w:ascii="Arial" w:hAnsi="Arial" w:cs="Arial"/>
-          <w:sz w:val="22"/>
-          <w:szCs w:val="22"/>
-          <w:lang w:val="es-AR"/>
-        </w:rPr>
-      </w:pPr>
-      <w:r>
-        <w:rPr>
-          <w:rFonts w:ascii="Arial" w:hAnsi="Arial" w:cs="Arial"/>
-          <w:sz w:val="22"/>
-          <w:szCs w:val="22"/>
-          <w:lang w:val="es-AR"/>
-        </w:rPr>
-        <w:t xml:space="preserve">Ante esta situación, se plantea la necesidad de implementar un sistema que permita </w:t>
-      </w:r>
-      <w:r>
-        <w:rPr>
-          <w:rFonts w:ascii="Arial" w:hAnsi="Arial" w:cs="Arial"/>
+        <w:t>capacidad establecida por la Resolución 3367/05, Anexo 4</w:t>
+      </w:r>
+      <w:r>
+        <w:rPr>
+          <w:sz w:val="22"/>
+          <w:szCs w:val="22"/>
+          <w:lang w:val="es-AR"/>
+        </w:rPr>
+        <w:t>.</w:t>
+      </w:r>
+    </w:p>
+    <w:p>
+      <w:pPr>
+        <w:rPr>
+          <w:sz w:val="22"/>
+          <w:szCs w:val="22"/>
+          <w:lang w:val="es-AR"/>
+        </w:rPr>
+      </w:pPr>
+      <w:r>
+        <w:rPr>
+          <w:sz w:val="22"/>
+          <w:szCs w:val="22"/>
+          <w:lang w:val="es-AR"/>
+        </w:rPr>
+        <w:lastRenderedPageBreak/>
+        <w:t xml:space="preserve">El sistema funcionará como una herramienta de </w:t>
+      </w:r>
+      <w:r>
+        <w:rPr>
           <w:b/>
           <w:bCs/>
           <w:sz w:val="22"/>
           <w:szCs w:val="22"/>
           <w:lang w:val="es-AR"/>
         </w:rPr>
-        <w:t>optimizar y agilizar la conformación de los listados de inscripción</w:t>
-      </w:r>
-      <w:r>
-        <w:rPr>
-          <w:rFonts w:ascii="Arial" w:hAnsi="Arial" w:cs="Arial"/>
-          <w:sz w:val="22"/>
-          <w:szCs w:val="22"/>
-          <w:lang w:val="es-AR"/>
-        </w:rPr>
-        <w:t>, automatizando aquellas tareas que puedan ser sistematizadas, como la organización de los alumnos según los criterios establecidos, el cálculo de la distancia al establecimiento y la organización de los turnos preferidos. De esta manera, se busca reducir los tiempos destinados a estas tareas y disminuir la posibilidad de errores, permitiendo que el secretario de la institución pueda disponer de mayor tiempo para realizar otras actividades administrativas.</w:t>
-      </w:r>
-    </w:p>
-    <w:p>
-      <w:pPr>
-        <w:pStyle w:val="Prrafodelista"/>
-        <w:rPr>
-          <w:rFonts w:ascii="Arial" w:hAnsi="Arial" w:cs="Arial"/>
-          <w:sz w:val="22"/>
-          <w:szCs w:val="22"/>
+        <w:t>asistencia al proceso de inscripción</w:t>
+      </w:r>
+      <w:r>
+        <w:rPr>
+          <w:sz w:val="22"/>
+          <w:szCs w:val="22"/>
+          <w:lang w:val="es-AR"/>
+        </w:rPr>
+        <w:t>, automatizando aquellas tareas que puedan ser sistematizadas y dejando bajo responsabilidad del personal de la institución la revisión y validación de los casos que requieran intervención humana.</w:t>
+      </w:r>
+    </w:p>
+    <w:p>
+      <w:pPr>
+        <w:pStyle w:val="Ttulo2"/>
+        <w:rPr>
+          <w:sz w:val="28"/>
+          <w:szCs w:val="28"/>
+          <w:lang w:val="es-AR"/>
+        </w:rPr>
+      </w:pPr>
+      <w:r>
+        <w:rPr>
+          <w:sz w:val="28"/>
+          <w:szCs w:val="28"/>
+          <w:lang w:val="es-AR"/>
+        </w:rPr>
+        <w:t>Alcance mínimo comprometido</w:t>
+      </w:r>
+    </w:p>
+    <w:p>
+      <w:pPr>
+        <w:rPr>
+          <w:sz w:val="22"/>
+          <w:szCs w:val="22"/>
+          <w:lang w:val="es-AR"/>
+        </w:rPr>
+      </w:pPr>
+      <w:r>
+        <w:rPr>
+          <w:sz w:val="22"/>
+          <w:szCs w:val="22"/>
+          <w:lang w:val="es-AR"/>
+        </w:rPr>
+        <w:t>El proyecto contempla una aplicación orientada a la organización de las inscripciones y la generación de listados de alumnos.</w:t>
+      </w:r>
+    </w:p>
+    <w:p>
+      <w:pPr>
+        <w:rPr>
+          <w:sz w:val="22"/>
+          <w:szCs w:val="22"/>
+          <w:lang w:val="es-AR"/>
+        </w:rPr>
+      </w:pPr>
+      <w:r>
+        <w:rPr>
+          <w:sz w:val="22"/>
+          <w:szCs w:val="22"/>
+          <w:lang w:val="es-AR"/>
+        </w:rPr>
+        <w:t>Como mínimo, deberá permitir:</w:t>
+      </w:r>
+    </w:p>
+    <w:p>
+      <w:pPr>
+        <w:numPr>
+          <w:ilvl w:val="0"/>
+          <w:numId w:val="2"/>
+        </w:numPr>
+        <w:rPr>
+          <w:sz w:val="22"/>
+          <w:szCs w:val="22"/>
+          <w:lang w:val="es-AR"/>
+        </w:rPr>
+      </w:pPr>
+      <w:r>
+        <w:rPr>
+          <w:sz w:val="22"/>
+          <w:szCs w:val="22"/>
+          <w:lang w:val="es-AR"/>
+        </w:rPr>
+        <w:t>Registrar los datos necesarios de los alumnos y sus responsables.</w:t>
+      </w:r>
+    </w:p>
+    <w:p>
+      <w:pPr>
+        <w:numPr>
+          <w:ilvl w:val="0"/>
+          <w:numId w:val="2"/>
+        </w:numPr>
+        <w:rPr>
+          <w:sz w:val="22"/>
+          <w:szCs w:val="22"/>
+          <w:lang w:val="es-AR"/>
+        </w:rPr>
+      </w:pPr>
+      <w:r>
+        <w:rPr>
+          <w:sz w:val="22"/>
+          <w:szCs w:val="22"/>
+          <w:lang w:val="es-AR"/>
+        </w:rPr>
+        <w:t>Registrar el domicilio y el turno preferido.</w:t>
+      </w:r>
+    </w:p>
+    <w:p>
+      <w:pPr>
+        <w:numPr>
+          <w:ilvl w:val="0"/>
+          <w:numId w:val="2"/>
+        </w:numPr>
+        <w:rPr>
+          <w:sz w:val="22"/>
+          <w:szCs w:val="22"/>
+          <w:lang w:val="es-AR"/>
+        </w:rPr>
+      </w:pPr>
+      <w:r>
+        <w:rPr>
+          <w:sz w:val="22"/>
+          <w:szCs w:val="22"/>
+          <w:lang w:val="es-AR"/>
+        </w:rPr>
+        <w:t>Calcular la distancia entre el domicilio y el establecimiento.</w:t>
+      </w:r>
+    </w:p>
+    <w:p>
+      <w:pPr>
+        <w:numPr>
+          <w:ilvl w:val="0"/>
+          <w:numId w:val="2"/>
+        </w:numPr>
+        <w:rPr>
+          <w:sz w:val="22"/>
+          <w:szCs w:val="22"/>
+          <w:lang w:val="es-AR"/>
+        </w:rPr>
+      </w:pPr>
+      <w:r>
+        <w:rPr>
+          <w:sz w:val="22"/>
+          <w:szCs w:val="22"/>
+          <w:lang w:val="es-AR"/>
+        </w:rPr>
+        <w:t xml:space="preserve">Organizar las solicitudes de acuerdo con los criterios de prioridad establecidos en el </w:t>
+      </w:r>
+      <w:r>
+        <w:rPr>
+          <w:b/>
+          <w:bCs/>
+          <w:sz w:val="22"/>
+          <w:szCs w:val="22"/>
+          <w:lang w:val="es-AR"/>
+        </w:rPr>
+        <w:t>Decreto 2299/11, artículos 130° y 131°</w:t>
+      </w:r>
+      <w:r>
+        <w:rPr>
+          <w:sz w:val="22"/>
+          <w:szCs w:val="22"/>
+          <w:lang w:val="es-AR"/>
+        </w:rPr>
+        <w:t>.</w:t>
+      </w:r>
+    </w:p>
+    <w:p>
+      <w:pPr>
+        <w:numPr>
+          <w:ilvl w:val="0"/>
+          <w:numId w:val="2"/>
+        </w:numPr>
+        <w:rPr>
+          <w:sz w:val="22"/>
+          <w:szCs w:val="22"/>
+          <w:lang w:val="es-AR"/>
+        </w:rPr>
+      </w:pPr>
+      <w:r>
+        <w:rPr>
+          <w:sz w:val="22"/>
+          <w:szCs w:val="22"/>
+          <w:lang w:val="es-AR"/>
+        </w:rPr>
+        <w:t xml:space="preserve">Organizar a los alumnos considerando la capacidad de las secciones establecida en la </w:t>
+      </w:r>
+      <w:r>
+        <w:rPr>
+          <w:b/>
+          <w:bCs/>
+          <w:sz w:val="22"/>
+          <w:szCs w:val="22"/>
+          <w:lang w:val="es-AR"/>
+        </w:rPr>
+        <w:t>Resolución 3367/05, Anexo 4</w:t>
+      </w:r>
+      <w:r>
+        <w:rPr>
+          <w:sz w:val="22"/>
+          <w:szCs w:val="22"/>
+          <w:lang w:val="es-AR"/>
+        </w:rPr>
+        <w:t>.</w:t>
+      </w:r>
+    </w:p>
+    <w:p>
+      <w:pPr>
+        <w:numPr>
+          <w:ilvl w:val="0"/>
+          <w:numId w:val="2"/>
+        </w:numPr>
+        <w:rPr>
+          <w:sz w:val="22"/>
+          <w:szCs w:val="22"/>
+          <w:lang w:val="es-AR"/>
+        </w:rPr>
+      </w:pPr>
+      <w:r>
+        <w:rPr>
+          <w:sz w:val="22"/>
+          <w:szCs w:val="22"/>
+          <w:lang w:val="es-AR"/>
+        </w:rPr>
+        <w:t>Generar un listado organizado para su posterior revisión por parte del personal responsable.</w:t>
+      </w:r>
+    </w:p>
+    <w:p>
+      <w:pPr>
+        <w:rPr>
+          <w:sz w:val="22"/>
+          <w:szCs w:val="22"/>
+          <w:lang w:val="es-AR"/>
+        </w:rPr>
+      </w:pPr>
+      <w:r>
+        <w:rPr>
+          <w:sz w:val="22"/>
+          <w:szCs w:val="22"/>
+          <w:lang w:val="es-AR"/>
+        </w:rPr>
+        <w:t xml:space="preserve">El sistema </w:t>
+      </w:r>
+      <w:r>
+        <w:rPr>
+          <w:b/>
+          <w:bCs/>
+          <w:sz w:val="22"/>
+          <w:szCs w:val="22"/>
+          <w:lang w:val="es-AR"/>
+        </w:rPr>
+        <w:t>no reemplazará la decisión final del personal de la institución</w:t>
+      </w:r>
+      <w:r>
+        <w:rPr>
+          <w:sz w:val="22"/>
+          <w:szCs w:val="22"/>
+          <w:lang w:val="es-AR"/>
+        </w:rPr>
+        <w:t xml:space="preserve"> en aquellos casos que requieran interpretación, validación o intervención administrativa. Tampoco se contempla dentro del alcance mínimo la gestión integral de la institución ni otras funciones administrativas ajenas al proceso de inscripción.</w:t>
+      </w:r>
+    </w:p>
+    <w:p>
+      <w:pPr>
+        <w:pStyle w:val="Ttulo2"/>
+        <w:rPr>
+          <w:sz w:val="28"/>
+          <w:szCs w:val="28"/>
+          <w:lang w:val="es-AR"/>
+        </w:rPr>
+      </w:pPr>
+      <w:r>
+        <w:rPr>
+          <w:sz w:val="28"/>
+          <w:szCs w:val="28"/>
+          <w:lang w:val="es-AR"/>
+        </w:rPr>
+        <w:t>Metodología</w:t>
+      </w:r>
+    </w:p>
+    <w:p>
+      <w:pPr>
+        <w:rPr>
+          <w:sz w:val="22"/>
+          <w:szCs w:val="22"/>
+          <w:lang w:val="es-AR"/>
+        </w:rPr>
+      </w:pPr>
+      <w:r>
+        <w:rPr>
+          <w:sz w:val="22"/>
+          <w:szCs w:val="22"/>
+          <w:lang w:val="es-AR"/>
+        </w:rPr>
+        <w:t xml:space="preserve">Para el desarrollo del proyecto se utilizará la metodología </w:t>
+      </w:r>
+      <w:r>
+        <w:rPr>
+          <w:b/>
+          <w:bCs/>
+          <w:sz w:val="22"/>
+          <w:szCs w:val="22"/>
+          <w:lang w:val="es-AR"/>
+        </w:rPr>
+        <w:t>Scrum</w:t>
+      </w:r>
+      <w:r>
+        <w:rPr>
+          <w:sz w:val="22"/>
+          <w:szCs w:val="22"/>
+          <w:lang w:val="es-AR"/>
+        </w:rPr>
+        <w:t>, permitiendo organizar el trabajo de manera iterativa e incremental mediante la planificación y seguimiento de las distintas tareas que conforman el proyecto.</w:t>
+      </w:r>
+    </w:p>
+    <w:p>
+      <w:pPr>
+        <w:rPr>
           <w:lang w:val="es-AR"/>
         </w:rPr>
       </w:pPr>
@@ -777,8 +1163,160 @@
       </w:rPr>
     </w:lvl>
   </w:abstractNum>
+  <w:abstractNum w:abstractNumId="1" w15:restartNumberingAfterBreak="0">
+    <w:nsid w:val="6F0F6E36"/>
+    <w:multiLevelType w:val="multilevel"/>
+    <w:tmpl w:val="A69A001E"/>
+    <w:lvl w:ilvl="0">
+      <w:start w:val="1"/>
+      <w:numFmt w:val="bullet"/>
+      <w:lvlText w:val=""/>
+      <w:lvlJc w:val="left"/>
+      <w:pPr>
+        <w:tabs>
+          <w:tab w:val="num" w:pos="720"/>
+        </w:tabs>
+        <w:ind w:left="720" w:hanging="360"/>
+      </w:pPr>
+      <w:rPr>
+        <w:rFonts w:ascii="Symbol" w:hAnsi="Symbol" w:hint="default"/>
+        <w:sz w:val="20"/>
+      </w:rPr>
+    </w:lvl>
+    <w:lvl w:ilvl="1" w:tentative="1">
+      <w:start w:val="1"/>
+      <w:numFmt w:val="bullet"/>
+      <w:lvlText w:val="o"/>
+      <w:lvlJc w:val="left"/>
+      <w:pPr>
+        <w:tabs>
+          <w:tab w:val="num" w:pos="1440"/>
+        </w:tabs>
+        <w:ind w:left="1440" w:hanging="360"/>
+      </w:pPr>
+      <w:rPr>
+        <w:rFonts w:ascii="Courier New" w:hAnsi="Courier New" w:hint="default"/>
+        <w:sz w:val="20"/>
+      </w:rPr>
+    </w:lvl>
+    <w:lvl w:ilvl="2" w:tentative="1">
+      <w:start w:val="1"/>
+      <w:numFmt w:val="bullet"/>
+      <w:lvlText w:val=""/>
+      <w:lvlJc w:val="left"/>
+      <w:pPr>
+        <w:tabs>
+          <w:tab w:val="num" w:pos="2160"/>
+        </w:tabs>
+        <w:ind w:left="2160" w:hanging="360"/>
+      </w:pPr>
+      <w:rPr>
+        <w:rFonts w:ascii="Wingdings" w:hAnsi="Wingdings" w:hint="default"/>
+        <w:sz w:val="20"/>
+      </w:rPr>
+    </w:lvl>
+    <w:lvl w:ilvl="3" w:tentative="1">
+      <w:start w:val="1"/>
+      <w:numFmt w:val="bullet"/>
+      <w:lvlText w:val=""/>
+      <w:lvlJc w:val="left"/>
+      <w:pPr>
+        <w:tabs>
+          <w:tab w:val="num" w:pos="2880"/>
+        </w:tabs>
+        <w:ind w:left="2880" w:hanging="360"/>
+      </w:pPr>
+      <w:rPr>
+        <w:rFonts w:ascii="Wingdings" w:hAnsi="Wingdings" w:hint="default"/>
+        <w:sz w:val="20"/>
+      </w:rPr>
+    </w:lvl>
+    <w:lvl w:ilvl="4" w:tentative="1">
+      <w:start w:val="1"/>
+      <w:numFmt w:val="bullet"/>
+      <w:lvlText w:val=""/>
+      <w:lvlJc w:val="left"/>
+      <w:pPr>
+        <w:tabs>
+          <w:tab w:val="num" w:pos="3600"/>
+        </w:tabs>
+        <w:ind w:left="3600" w:hanging="360"/>
+      </w:pPr>
+      <w:rPr>
+        <w:rFonts w:ascii="Wingdings" w:hAnsi="Wingdings" w:hint="default"/>
+        <w:sz w:val="20"/>
+      </w:rPr>
+    </w:lvl>
+    <w:lvl w:ilvl="5" w:tentative="1">
+      <w:start w:val="1"/>
+      <w:numFmt w:val="bullet"/>
+      <w:lvlText w:val=""/>
+      <w:lvlJc w:val="left"/>
+      <w:pPr>
+        <w:tabs>
+          <w:tab w:val="num" w:pos="4320"/>
+        </w:tabs>
+        <w:ind w:left="4320" w:hanging="360"/>
+      </w:pPr>
+      <w:rPr>
+        <w:rFonts w:ascii="Wingdings" w:hAnsi="Wingdings" w:hint="default"/>
+        <w:sz w:val="20"/>
+      </w:rPr>
+    </w:lvl>
+    <w:lvl w:ilvl="6" w:tentative="1">
+      <w:start w:val="1"/>
+      <w:numFmt w:val="bullet"/>
+      <w:lvlText w:val=""/>
+      <w:lvlJc w:val="left"/>
+      <w:pPr>
+        <w:tabs>
+          <w:tab w:val="num" w:pos="5040"/>
+        </w:tabs>
+        <w:ind w:left="5040" w:hanging="360"/>
+      </w:pPr>
+      <w:rPr>
+        <w:rFonts w:ascii="Wingdings" w:hAnsi="Wingdings" w:hint="default"/>
+        <w:sz w:val="20"/>
+      </w:rPr>
+    </w:lvl>
+    <w:lvl w:ilvl="7" w:tentative="1">
+      <w:start w:val="1"/>
+      <w:numFmt w:val="bullet"/>
+      <w:lvlText w:val=""/>
+      <w:lvlJc w:val="left"/>
+      <w:pPr>
+        <w:tabs>
+          <w:tab w:val="num" w:pos="5760"/>
+        </w:tabs>
+        <w:ind w:left="5760" w:hanging="360"/>
+      </w:pPr>
+      <w:rPr>
+        <w:rFonts w:ascii="Wingdings" w:hAnsi="Wingdings" w:hint="default"/>
+        <w:sz w:val="20"/>
+      </w:rPr>
+    </w:lvl>
+    <w:lvl w:ilvl="8" w:tentative="1">
+      <w:start w:val="1"/>
+      <w:numFmt w:val="bullet"/>
+      <w:lvlText w:val=""/>
+      <w:lvlJc w:val="left"/>
+      <w:pPr>
+        <w:tabs>
+          <w:tab w:val="num" w:pos="6480"/>
+        </w:tabs>
+        <w:ind w:left="6480" w:hanging="360"/>
+      </w:pPr>
+      <w:rPr>
+        <w:rFonts w:ascii="Wingdings" w:hAnsi="Wingdings" w:hint="default"/>
+        <w:sz w:val="20"/>
+      </w:rPr>
+    </w:lvl>
+  </w:abstractNum>
   <w:num w:numId="1" w16cid:durableId="621881751">
     <w:abstractNumId w:val="0"/>
+  </w:num>
+  <w:num w:numId="2" w16cid:durableId="2006786783">
+    <w:abstractNumId w:val="1"/>
   </w:num>
 </w:numbering>
 </file>
@@ -1211,7 +1749,6 @@
     <w:next w:val="Normal"/>
     <w:link w:val="Ttulo2Car"/>
     <w:uiPriority w:val="9"/>
-    <w:semiHidden/>
     <w:unhideWhenUsed/>
     <w:qFormat/>
     <w:rsid w:val="00D92E69"/>
@@ -1427,7 +1964,6 @@
     <w:basedOn w:val="Fuentedeprrafopredeter"/>
     <w:link w:val="Ttulo2"/>
     <w:uiPriority w:val="9"/>
-    <w:semiHidden/>
     <w:rsid w:val="00D92E69"/>
     <w:rPr>
       <w:rFonts w:asciiTheme="majorHAnsi" w:eastAsiaTheme="majorEastAsia" w:hAnsiTheme="majorHAnsi" w:cstheme="majorBidi"/>

</xml_diff>